<commit_message>
Add 2026 audit page and paper Fig. 6; fix stale-module ImportError on Streamlit Cloud
- New Forecasting > 2026 audit page: fit/select/refit/forecast/score steps with exact hour counts,
  computed vs forecast for every Jan-Jun 2026 hour, live physics re-run against the scoring
  reference (max diff 9.9e-07 MW), the 2026 automated checks and a CSV download.
- streamlit_app.py drops the habagat package from sys.modules when its files change, so a
  Cloud git pull can no longer leave pages importing names from the old module.
- Paper: Fig. 6 (2026 daily energy, computed vs XGBoost forecast) added to the reference-audited
  manuscript; still eight pages.

Co-Authored-By: Claude Opus 5.5 <noreply@anthropic.com>
</commit_message>
<xml_diff>
--- a/paper/IEEE_Solar_Wind_Paper.docx
+++ b/paper/IEEE_Solar_Wind_Paper.docx
@@ -249,7 +249,7 @@
         <w:pStyle w:val="BodyText"/>
       </w:pPr>
       <w:r>
-        <w:t>Pilario et al. assessed solar and wind complementarity in Kalinga and Apayao [1]. Their analysis motivates checking temporal overlap rather than assuming that wind always fills low solar periods. Supapo et al. used hourly resource and demand assumptions to study renewable transition scenarios for off grid Philippine islands [2]. Lacea et al. considered solar, battery, and diesel supply for households in Cebu [3]. These studies show why energy and load must be evaluated together, but none provides measured output for the three equipment and location cases used here.</w:t>
+        <w:t>Pilario et al. assessed solar and wind complementarity in Kalinga and Apayao [1]. Their analysis motivates checking temporal overlap rather than assuming that wind always fills low solar periods. Supapo et al. used resource estimates and hourly utility load records to study renewable transition scenarios for off grid Philippine islands [2]. Lacea et al. considered solar, battery, and diesel supply for households in Cebu [3]. These studies show why energy and load must be evaluated together, but none provides measured output for the three equipment and location cases used here.</w:t>
       </w:r>
     </w:p>
     <w:p>
@@ -281,7 +281,7 @@
         <w:pStyle w:val="BodyText"/>
       </w:pPr>
       <w:r>
-        <w:t>Kavaz and Karazor used the preceding 24 hours to predict the next 24 hours at a colocated wind and photovoltaic plant [11]. Their horizon structure informed the forecast design in this study. They reported strong RMSE and MSE performance for boosting methods including XGBoost, while other models led on MAE. This supports XGBoost as a candidate, not as a guaranteed winner. Their target was measured plant output and cannot supply Philippine error estimates. Zhang et al. jointly forecast renewable power and load [12], but that design requires measured load records that this study lacks. Freeman and Agar [13] and Zarate-Perez et al. [14] demonstrate why generation forecasts should be evaluated through a chronological demand and storage balance.</w:t>
+        <w:t>Kavaz and Karazor used the preceding 24 hours to predict the next 24 hours at a colocated wind and photovoltaic plant [11]. Their horizon structure informed this study. They reported strong RMSE and MSE performance for boosting methods including XGBoost, while other models led on MAE. This supports XGBoost as a candidate. Their measured plant target cannot supply Philippine error estimates. Zhang et al. jointly forecast renewable power and load [12]; we lack measured local load to evaluate such a joint forecast. Freeman and Agar analyzed wind-solar supply and storage in New England [13]. Zarate-Perez et al. simulated residential PV/wind/battery supply with hourly demand and weather [14]. These energy-balance studies motivate our demand and storage replay.</w:t>
       </w:r>
     </w:p>
     <w:p>
@@ -289,7 +289,7 @@
         <w:pStyle w:val="BodyText"/>
       </w:pPr>
       <w:r>
-        <w:t>Chen and Guestrin describe the regularized tree boosting method underlying XGBoost [15]. Its ability to fit nonlinear relationships in lagged and calendar variables, modest tuning budget, and direct tabular inputs make it practical here. Hu et al. found data quality and training volume important in a more complex CNN-BiLSTM-Attention forecast [16]. Zhang et al. studied regional joint wind and solar forecasting with an attention network [17]. Earlier systems combined numerical weather prediction with statistical models for next-day and four-hour farm forecasts in China [18], trained feed-forward networks for one-hour-ahead load, wind and solar forecasts in France [19], specialized neural networks with a genetic algorithm for 168-hour forecasts in Uruguay [20], and used LSTM irradiance predictions to size street-lamp photovoltaic systems in Jakarta [21]. Such models can use spatial relationships that the three independent point cases in this study do not provide. This study checks continuity and uses preceding-year model selection in chronological test folds, but does not benchmark deep networks. XGBoost is assessed against the same simple baselines in every fold rather than selected using transferred performance claims.</w:t>
+        <w:t>Chen and Guestrin describe the regularized tree boosting method underlying XGBoost [15]. Its ability to fit nonlinear relationships in lagged and calendar variables, modest tuning budget, and direct tabular inputs make it practical here. Hu et al. compared data cleaning and input duration in a more complex CNN-BiLSTM-Attention forecast [16]. Zhang et al. studied regional joint wind and solar forecasting with an attention network [17]. Earlier systems combined numerical weather prediction with statistical models for next-day and four-hour farm forecasts in China [18], trained feed-forward networks for one-hour-ahead load, wind and solar forecasts in France [19], specialized neural networks with a genetic algorithm for 168-hour forecasts in Uruguay [20], and used LSTM irradiance predictions to size street-lamp photovoltaic systems in Jakarta [21]. The regional attention model can use spatial relationships that the three independent point cases in this study do not provide. This study checks continuity and uses preceding-year model selection in chronological test folds, but does not benchmark deep networks. XGBoost is assessed against the same simple baselines in every fold rather than selected using transferred performance claims.</w:t>
       </w:r>
     </w:p>
     <w:p>
@@ -305,7 +305,7 @@
         <w:pStyle w:val="BodyText"/>
       </w:pPr>
       <w:r>
-        <w:t>Philippine planning studies emphasize sizing and electrical behavior. A University of the Philippines tool simulates 8,760 hourly balances, interruptions and expected energy not supplied [22], and a genetic algorithm sizes isolated microgrids under cost or reliability targets [23]. HOMER studies optimized hybrid designs for Basco [24] and Sibuyan Island [25]. Simulink studies examined battery support during faults [26] and photovoltaic output across Philippine climates [27]. Table I contrasts these studies with the present design. Most forecasting work splits a single measured record by ratio, and the Philippine studies do not score forecasts. This study evaluates whole held-out years in order and links each forecast to the same storage plan, at the cost of using modeled rather than measured output.</w:t>
+        <w:t>Philippine planning studies emphasize sizing and electrical behavior. A University of the Philippines tool simulates 8,760 hourly balances, interruptions and expected energy not supplied [22], and a genetic algorithm sizes isolated microgrids under cost or reliability targets [23]. HOMER studies optimized hybrid designs for Basco [24] and Sibuyan Island [25]. Simulink studies examined battery support during faults [26] and photovoltaic output across Philippine climates [27]. Table I contrasts these studies with the present design. Evaluation designs differ: Vallejo et al. used an earlier fitting interval and a later test interval [20]. The Philippine planning studies address scenarios rather than forecast-error comparisons. This study evaluates whole held-out years in order and links each forecast to the same storage plan, at the cost of using modeled rather than measured output.</w:t>
       </w:r>
     </w:p>
     <w:p>
@@ -536,7 +536,7 @@
                 <w:b w:val="0"/>
                 <w:sz w:val="16"/>
               </w:rPr>
-              <w:t>Random 7:3 split</w:t>
+              <w:t>7:3 split</w:t>
             </w:r>
           </w:p>
         </w:tc>
@@ -591,7 +591,7 @@
                 <w:b w:val="0"/>
                 <w:sz w:val="16"/>
               </w:rPr>
-              <w:t>Measured, Turkey</w:t>
+              <w:t>Measured, Denmark</w:t>
             </w:r>
           </w:p>
         </w:tc>
@@ -956,7 +956,7 @@
                 <w:b w:val="0"/>
                 <w:sz w:val="16"/>
               </w:rPr>
-              <w:t>Hold-out MAPE</w:t>
+              <w:t>Test-period MAPE</w:t>
             </w:r>
           </w:p>
         </w:tc>
@@ -1061,7 +1061,7 @@
                 <w:b w:val="0"/>
                 <w:sz w:val="16"/>
               </w:rPr>
-              <w:t>Versus prior model</w:t>
+              <w:t>Chronological 70/30</w:t>
             </w:r>
           </w:p>
         </w:tc>
@@ -1166,7 +1166,7 @@
                 <w:b w:val="0"/>
                 <w:sz w:val="16"/>
               </w:rPr>
-              <w:t>Random 85:15 split</w:t>
+              <w:t>85:15 split</w:t>
             </w:r>
           </w:p>
         </w:tc>
@@ -1246,7 +1246,7 @@
                 <w:b w:val="0"/>
                 <w:sz w:val="16"/>
               </w:rPr>
-              <w:t>Annual sizing</w:t>
+              <w:t>Hourly / dynamics</w:t>
             </w:r>
           </w:p>
         </w:tc>
@@ -1387,7 +1387,7 @@
         <w:pStyle w:val="BodyText"/>
       </w:pPr>
       <w:r>
-        <w:t>Together, the reviewed work supports three choices: identical equipment for a fair site comparison, chronological forecast evaluation, and a common demand and battery replay. This study connects them in one auditable workflow. It does not transfer accuracy from foreign plants or infer operating reliability from annual energy. The research question is whether a lag-based XGBoost forecast improves both modeled generation error and the defined grid planning disagreement over simple baselines.</w:t>
+        <w:t>The reviewed work motivates temporal resource analysis and demand/storage balancing. This study uses identical equipment, chronological forecast tests, and common demand and battery rules to connect these questions in one workflow. It does not transfer foreign plant accuracy or infer operating reliability from annual energy. The question is whether lag-based XGBoost improves modeled generation error and grid planning disagreement over simple baselines.</w:t>
       </w:r>
     </w:p>
     <w:p>
@@ -1411,7 +1411,7 @@
         <w:pStyle w:val="BodyText"/>
       </w:pPr>
       <w:r>
-        <w:t>Hourly weather estimates were downloaded as CSV from the NASA POWER Hourly Point API for Laoag (18.182931° N, 120.534394° E), Mactan (10.322444° N, 123.980131° E), and General Santos (6.057181° N, 125.103108° E) [28]. The coordinates and site elevations came from PAGASA station profiles [29]–[31]; the returned weather values represent NASA grid cells, not station observations or surveyed plant sites. Requests specified the renewable energy community, each coordinate and elevation, UTC, and the historical date range. They included all sky global irradiance, 2 m air temperature, 50 m wind speed, and pressure; direct normal and diffuse horizontal irradiance were requested separately and joined one to one by UTC hour.</w:t>
+        <w:t>Hourly weather estimates were downloaded as CSV from the NASA POWER Hourly Point API for Laoag (18.182931° N, 120.534394° E), Mactan (10.322444° N, 123.980131° E), and General Santos (6.057181° N, 125.103108° E) [28]. The coordinates and site elevations came from PAGASA climatological extremes tables, with station metadata as of 2014 [29]–[31]; the returned weather values represent NASA grid cells, not station observations or surveyed plant sites. Requests specified the renewable energy community, each coordinate and elevation, UTC, and the historical date range. They included all sky global irradiance, 2 m air temperature, 50 m wind speed, and pressure; direct normal and diffuse horizontal irradiance were requested separately and joined one to one by UTC hour.</w:t>
       </w:r>
     </w:p>
     <w:p>
@@ -2109,7 +2109,7 @@
         <w:pStyle w:val="BodyText"/>
       </w:pPr>
       <w:r>
-        <w:t>Solar position follows NOAA equations evaluated at each hourly midpoint [33]. Plane-of-array irradiance uses direct incidence, isotropic diffuse sky and ground-reflected components, with 0.20 ground albedo [34]. A Faiman temperature model uses U₀ = 25 and U₁ = 6.84 [35]. Its wind input extrapolates the 10 m estimate to a 2 m module height with exponent 0.14. Temperature and AC output follow:</w:t>
+        <w:t>Solar position follows NOAA equations at each hourly midpoint [33]. Plane-of-array irradiance sums direct incidence, isotropic diffuse sky and ground reflection [34]. Ground albedo is assumed to be 0.20. The Faiman model uses U₀ = 25 and U₁ = 6.84 [35]. Its wind input assumes a 2 m module height and extrapolates the 10 m estimate with exponent 0.14. These height and extrapolation choices are study assumptions. Temperature and AC output follow:</w:t>
       </w:r>
     </w:p>
     <w:p>
@@ -2171,7 +2171,7 @@
         <w:pStyle w:val="BodyText"/>
       </w:pPr>
       <w:r>
-        <w:t>Here PPV is in MW, GPOA is average irradiance in W/m², temperatures are in °C, and V₂ is in m/s. The 0.86 factor represents 14% system losses and 0.96 the fixed inverter efficiency. PV capacity is 1 MWdc; the AC upper limit is 1 MW. These are shared scenario assumptions, not locally calibrated equipment characteristics.</w:t>
+        <w:t>Here PPV is in MW, GPOA is average irradiance in W/m², temperatures are in °C, and V₂ is in m/s. The 0.86 factor represents 14% system losses and 0.96 the fixed inverter efficiency. PV capacity is 1 MWdc; the AC upper limit is 1 MW. These are shared scenario assumptions, not locally calibrated equipment characteristics. The temperature coefficient and nominal losses draw on PVWatts v5 [8], but the Faiman model and fixed inverter factor make this a study variant, not the complete PVWatts algorithm.</w:t>
       </w:r>
     </w:p>
     <w:p>
@@ -5428,7 +5428,55 @@
         <w:pStyle w:val="BodyText"/>
       </w:pPr>
       <w:r>
-        <w:t>In the matched calendar window, XGBoost again leads both baselines in all nine site-year cases. Laoag combined MAE is 0.1032, 0.1070 and 0.0953 MW for 2024, 2025 and 2026; Mactan is 0.0863, 0.0812 and 0.0837 MW; General Santos is 0.0695, 0.0624 and 0.0533 MW. Thus the XGBoost advantage over the baselines repeats across calendar years, while lower 2026 error cannot be attributed solely to adding training data. Year-specific weather and refitted weights both differ.</w:t>
+        <w:t>In the matched calendar window, XGBoost again leads both baselines in all nine site-year cases. Laoag combined MAE is 0.1032, 0.1070 and 0.0953 MW for 2024, 2025 and 2026; Mactan is 0.0863, 0.0812 and 0.0837 MW; General Santos is 0.0695, 0.0624 and 0.0533 MW. Thus the XGBoost advantage over the baselines repeats across calendar years, while lower 2026 error cannot be attributed solely to adding training data. Year-specific weather and refitted weights both differ. Fig. 6 compares the 2026 forecasts with output computed from 2026 weather.</w:t>
+      </w:r>
+    </w:p>
+    <w:p>
+      <w:pPr>
+        <w:keepNext/>
+        <w:spacing w:after="0"/>
+      </w:pPr>
+      <w:r>
+        <w:drawing>
+          <wp:inline xmlns:a="http://schemas.openxmlformats.org/drawingml/2006/main" xmlns:pic="http://schemas.openxmlformats.org/drawingml/2006/picture">
+            <wp:extent cx="3072384" cy="2011680"/>
+            <wp:docPr id="7" name="Picture 7"/>
+            <wp:cNvGraphicFramePr>
+              <a:graphicFrameLocks noChangeAspect="1"/>
+            </wp:cNvGraphicFramePr>
+            <a:graphic>
+              <a:graphicData uri="http://schemas.openxmlformats.org/drawingml/2006/picture">
+                <pic:pic>
+                  <pic:nvPicPr>
+                    <pic:cNvPr id="0" name="fig_2026_computed_vs_forecast.png"/>
+                    <pic:cNvPicPr/>
+                  </pic:nvPicPr>
+                  <pic:blipFill>
+                    <a:blip r:embed="rIdAudit2026"/>
+                    <a:stretch>
+                      <a:fillRect/>
+                    </a:stretch>
+                  </pic:blipFill>
+                  <pic:spPr>
+                    <a:xfrm>
+                      <a:off x="0" y="0"/>
+                      <a:ext cx="3072384" cy="2011680"/>
+                    </a:xfrm>
+                    <a:prstGeom prst="rect"/>
+                  </pic:spPr>
+                </pic:pic>
+              </a:graphicData>
+            </a:graphic>
+          </wp:inline>
+        </w:drawing>
+      </w:r>
+    </w:p>
+    <w:p>
+      <w:pPr>
+        <w:pStyle w:val="figurecaption"/>
+      </w:pPr>
+      <w:r>
+        <w:t>January-June 2026 daily energy computed from 2026 weather versus XGBoost forecasts issued at 00:00 by models trained only on 2020-2025 data (last target 31 December 2025, 23:00).</w:t>
       </w:r>
     </w:p>
     <w:p>
@@ -7236,13 +7284,14 @@
     </w:p>
     <w:p>
       <w:pPr>
+        <w:jc w:val="center"/>
         <w:keepNext/>
         <w:spacing w:after="0"/>
       </w:pPr>
       <w:r>
         <w:drawing>
           <wp:inline xmlns:a="http://schemas.openxmlformats.org/drawingml/2006/main" xmlns:pic="http://schemas.openxmlformats.org/drawingml/2006/picture">
-            <wp:extent cx="3072384" cy="3946700"/>
+            <wp:extent cx="2703697" cy="3473096"/>
             <wp:docPr id="6" name="Picture 6"/>
             <wp:cNvGraphicFramePr>
               <a:graphicFrameLocks noChangeAspect="1"/>
@@ -7263,7 +7312,7 @@
                   <pic:spPr>
                     <a:xfrm>
                       <a:off x="0" y="0"/>
-                      <a:ext cx="3072384" cy="3946700"/>
+                      <a:ext cx="2703697" cy="3473096"/>
                     </a:xfrm>
                     <a:prstGeom prst="rect"/>
                   </pic:spPr>
@@ -7779,7 +7828,7 @@
         <w:pStyle w:val="references"/>
       </w:pPr>
       <w:r>
-        <w:t>K. E. S. Pilario et al., “Spatio-temporal solar–wind complementarity assessment in the province of Kalinga-Apayao, Philippines using canonical correlation analysis,” Sustainability, vol. 14, no. 6, art. 3253, 2022, doi: 10.3390/su14063253.</w:t>
+        <w:t>K. E. S. Pilario, J. A. Ibañez, X. N. Penisa, J. B. Obra, C. M. F. Odulio, and J. D. Ocon, “Spatio-temporal solar–wind complementarity assessment in the province of Kalinga-Apayao, Philippines using canonical correlation analysis,” Sustainability, vol. 14, no. 6, art. 3253, 2022, doi: 10.3390/su14063253.</w:t>
       </w:r>
     </w:p>
     <w:p>
@@ -7787,7 +7836,7 @@
         <w:pStyle w:val="references"/>
       </w:pPr>
       <w:r>
-        <w:t>K. R. M. Supapo et al., “A backcasting analysis toward a 100% renewable energy transition by 2040 for off-grid islands,” Energies, vol. 15, no. 13, art. 4794, 2022, doi: 10.3390/en15134794.</w:t>
+        <w:t>K. R. M. Supapo, L. Lozano, I. D. F. Tabañag, and E. M. Querikiol, “A backcasting analysis toward a 100% renewable energy transition by 2040 for off-grid islands,” Energies, vol. 15, no. 13, art. 4794, 2022, doi: 10.3390/en15134794.</w:t>
       </w:r>
     </w:p>
     <w:p>
@@ -7827,7 +7876,7 @@
         <w:pStyle w:val="references"/>
       </w:pPr>
       <w:r>
-        <w:t>NASA POWER, “POWER data methodology,” NASA Langley Research Center. [Online]. Available: https://power.larc.nasa.gov/docs/methodology/. Accessed: Sep. 24, 2026.</w:t>
+        <w:t>NASA POWER, “POWER data methodology,” NASA Langley Research Center. [Online]. Available: https://power.larc.nasa.gov/docs/methodology/. Accessed: Oct. 5, 2026.</w:t>
       </w:r>
     </w:p>
     <w:p>
@@ -7835,7 +7884,7 @@
         <w:pStyle w:val="references"/>
       </w:pPr>
       <w:r>
-        <w:t>A. P. Dobos, “PVWatts version 5 manual,” National Renewable Energy Laboratory, 2014. [Online]. Available: https://pvwatts.nrel.gov/downloads/pvwattsv5.pdf.</w:t>
+        <w:t>A. P. Dobos, “PVWatts version 5 manual,” National Renewable Energy Laboratory, Rep. NREL/TP-6A20-62641, Sep. 2014. [Online]. Available: https://docs.nlr.gov/docs/fy14osti/62641.pdf. Accessed: Oct. 5, 2026.</w:t>
       </w:r>
     </w:p>
     <w:p>
@@ -7843,7 +7892,7 @@
         <w:pStyle w:val="references"/>
       </w:pPr>
       <w:r>
-        <w:t>EWT, “DW61,” manufacturer brochure. [Online]. Available: https://ewtdirectwind.com/wp-content/uploads/2023/11/EWT_DW61.pdf.</w:t>
+        <w:t>EWT, “EWT DW61,” manufacturer brochure, n.d. [Online]. Available: https://ewtdirectwind.com/wp-content/uploads/2023/11/EWT_DW61.pdf. Accessed: Oct. 5, 2026.</w:t>
       </w:r>
     </w:p>
     <w:p>
@@ -7851,7 +7900,7 @@
         <w:pStyle w:val="references"/>
       </w:pPr>
       <w:r>
-        <w:t>National Laboratory of the Rockies, “EWT DW61 1 MW turbine model,” archived theoretical power curve. [Online]. Available: https://github.com/NatLabRockies/turbine-models/blob/e9e4ccc6a87f50c0c65d236154a2897e752c47c9/turbine_models/data/Distributed/EWT_DW61_1MW_60.9.csv.</w:t>
+        <w:t>National Laboratory of the Rockies, “EWT DW61 1 MW turbine model,” archived theoretical power curve. [Online]. Available: https://github.com/NatLabRockies/turbine-models/blob/e9e4ccc6a87f50c0c65d236154a2897e752c47c9/turbine_models/data/Distributed/EWT_DW61_1MW_60.9.csv. Accessed: Oct. 5, 2026.</w:t>
       </w:r>
     </w:p>
     <w:p>
@@ -7859,7 +7908,7 @@
         <w:pStyle w:val="references"/>
       </w:pPr>
       <w:r>
-        <w:t>A. G. Kavaz and A. Karazor, “Solar power forecasting by machine learning methods in a co-located wind and photovoltaic plant,” in Proc. 12th Int. Conf. Power Science and Engineering, 2023, doi: 10.1109/ICPSE59506.2023.10329287.</w:t>
+        <w:t>A. G. Kavaz and A. Karazor, “Solar power forecasting by machine learning methods in a co-located wind and photovoltaic plant,” in Proc. 12th Int. Conf. Power Science and Engineering, 2023, pp. 55-59, doi: 10.1109/ICPSE59506.2023.10329287.</w:t>
       </w:r>
     </w:p>
     <w:p>
@@ -7867,7 +7916,7 @@
         <w:pStyle w:val="references"/>
       </w:pPr>
       <w:r>
-        <w:t>J. Zhang, L. Zheng, S. Wang, L. Li, and Y. Ye, “Joint forecasting method for wind and solar power generation and electricity load,” in Proc. 2nd Int. Conf. Telecommunications and Power Electronics, 2025, doi: 10.1109/TELEPE66277.2025.00130.</w:t>
+        <w:t>J. Zhang, L. Zheng, S. Wang, L. Li, and Y. Ye, “Joint forecasting method for wind and solar power generation and electricity load,” in Proc. 2nd Int. Conf. Telecommunications and Power Electronics, 2025, pp. 681-685, doi: 10.1109/TELEPE66277.2025.00130.</w:t>
       </w:r>
     </w:p>
     <w:p>
@@ -7883,7 +7932,7 @@
         <w:pStyle w:val="references"/>
       </w:pPr>
       <w:r>
-        <w:t>E. Zarate-Perez, C. Santos-Mejía, and R. Sebastián, “Reliability of autonomous solar-wind microgrids with battery energy storage system applied in the residential sector,” Energy Reports, vol. 9, pp. 172–183, 2023, doi: 10.1016/j.egyr.2023.05.239.</w:t>
+        <w:t>E. Zarate-Perez, C. Santos-Mejía, and R. Sebastián, “Reliability of autonomous solar-wind microgrids with battery energy storage system applied in the residential sector,” Energy Reports, vol. 9, suppl. 9, pp. 172–183, 2023, doi: 10.1016/j.egyr.2023.05.239.</w:t>
       </w:r>
     </w:p>
     <w:p>
@@ -7899,7 +7948,7 @@
         <w:pStyle w:val="references"/>
       </w:pPr>
       <w:r>
-        <w:t>S. Hu et al., “CNN-BiLSTM-Attention model for wind and solar power forecasting and analysis of factors affecting forecast accuracy,” in Proc. 6th Int. Conf. Electrical, Electronic Information and Communication Engineering, 2025, doi: 10.1109/EEICE65049.2025.11033699.</w:t>
+        <w:t>S. Hu et al., “CNN-BiLSTM-Attention model for wind and solar power forecasting and analysis of factors affecting forecast accuracy,” in Proc. 6th Int. Conf. Electrical, Electronic Information and Communication Engineering, 2025, pp. 347-350, doi: 10.1109/EEICE65049.2025.11033699.</w:t>
       </w:r>
     </w:p>
     <w:p>
@@ -7915,7 +7964,7 @@
         <w:pStyle w:val="references"/>
       </w:pPr>
       <w:r>
-        <w:t>Z. Yan et al., “Integrated wind and solar power forecasting in China,” in Proc. 2013 IEEE Int. Conf. Service Operations and Logistics, and Informatics (SOLI), 2013, doi: 10.1109/SOLI.2013.6611466.</w:t>
+        <w:t>Z. Yan et al., “Integrated wind and solar power forecasting in China,” in Proc. 2013 IEEE Int. Conf. Service Operations and Logistics, and Informatics (SOLI), 2013, pp. 500-505, doi: 10.1109/SOLI.2013.6611466.</w:t>
       </w:r>
     </w:p>
     <w:p>
@@ -7923,7 +7972,7 @@
         <w:pStyle w:val="references"/>
       </w:pPr>
       <w:r>
-        <w:t>A. Laouafi, M. Mordjaoui, and D. Dib, “One-hour ahead electric load and wind-solar power generation forecasting using artificial neural network,” in Proc. 6th Int. Renewable Energy Congress (IREC), 2015, doi: 10.1109/IREC.2015.7110894.</w:t>
+        <w:t>A. Laouafi, M. Mordjaoui, and D. Dib, “One-hour ahead electric load and wind-solar power generation forecasting using artificial neural network,” in Proc. 6th Int. Renewable Energy Congress (IREC), 2015, pp. 1-6, doi: 10.1109/IREC.2015.7110894.</w:t>
       </w:r>
     </w:p>
     <w:p>
@@ -7931,7 +7980,7 @@
         <w:pStyle w:val="references"/>
       </w:pPr>
       <w:r>
-        <w:t>D. Vallejo, E. Cornalino, and R. Chaer, “Genetic algorithm applied to the specialization of neural networks for the forecast of wind and solar generation,” in Proc. 2018 IEEE 9th Power, Instrumentation and Measurement Meeting (EPIM), 2018.</w:t>
+        <w:t>D. Vallejo, E. Cornalino, and R. Chaer, “Genetic algorithm applied to the specialization of neural networks for the forecast of wind and solar generation,” in Proc. 2018 IEEE 9th Power, Instrumentation and Measurement Meeting (EPIM), 2018, pp. 1-4, doi: 10.1109/epim.2018.8756397.</w:t>
       </w:r>
     </w:p>
     <w:p>
@@ -7939,7 +7988,7 @@
         <w:pStyle w:val="references"/>
       </w:pPr>
       <w:r>
-        <w:t>M. S. Tambing, S. H. Supangkat, and D. W. Anggara, “Prediction of solar panel requirements based on solar irradiance and energy consumption data in Jakarta,” in Proc. 2025 Int. Conf. ICT for Smart Society (ICISS), 2025, doi: 10.1109/ICISS66954.2025.11389696.</w:t>
+        <w:t>M. S. Tambing, S. H. Supangkat, and D. W. Anggara, “Prediction of solar panel requirements based on solar irradiance and energy consumption data in Jakarta,” in Proc. 2025 Int. Conf. ICT for Smart Society (ICISS), 2025, pp. 1-6, doi: 10.1109/ICISS66954.2025.11389696.</w:t>
       </w:r>
     </w:p>
     <w:p>
@@ -7947,7 +7996,7 @@
         <w:pStyle w:val="references"/>
       </w:pPr>
       <w:r>
-        <w:t>L. E. R. Luya, P. C. Gan, and M. A. A. Pedrasa, “Simulation platform for supply deficient microgrids,” in Proc. 2016 IEEE Innovative Smart Grid Technologies - Asia (ISGT-Asia), 2016, doi: 10.1109/ISGT-Asia.2016.7796551.</w:t>
+        <w:t>L. E. R. Luya, P. C. Gan, and M. A. A. Pedrasa, “Simulation platform for supply deficient microgrids,” in Proc. 2016 IEEE Innovative Smart Grid Technologies - Asia (ISGT-Asia), 2016, pp. 1171-1176, doi: 10.1109/ISGT-Asia.2016.7796551.</w:t>
       </w:r>
     </w:p>
     <w:p>
@@ -7955,7 +8004,7 @@
         <w:pStyle w:val="references"/>
       </w:pPr>
       <w:r>
-        <w:t>D. C. Fronda, K. T. U. Rosendo, and M. A. A. Pedrasa, “Optimization of isolated microgrids with cost and reliability targets,” in Proc. 2017 IEEE Innovative Smart Grid Technologies - Asia (ISGT-Asia), 2017, doi: 10.1109/ISGT-Asia.2017.8378420.</w:t>
+        <w:t>D. C. Fronda, K. T. U. Rosendo, and M. A. A. Pedrasa, “Optimization of isolated microgrids with cost and reliability targets,” in Proc. 2017 IEEE Innovative Smart Grid Technologies - Asia (ISGT-Asia), 2017, pp. 1-6, doi: 10.1109/ISGT-Asia.2017.8378420.</w:t>
       </w:r>
     </w:p>
     <w:p>
@@ -7963,7 +8012,7 @@
         <w:pStyle w:val="references"/>
       </w:pPr>
       <w:r>
-        <w:t>C. E. Lin, B. C. Phan, and Y.-C. Lai, “Optimal design of hybrid renewable energy system using HOMER: A case study in the Philippines,” in Proc. 2019 SoutheastCon, 2019.</w:t>
+        <w:t>C. E. Lin, B. C. Phan, and Y.-C. Lai, “Optimal design of hybrid renewable energy system using HOMER: A case study in the Philippines,” in Proc. 2019 SoutheastCon, 2019, pp. 1-6, doi: 10.1109/southeastcon42311.2019.9020552.</w:t>
       </w:r>
     </w:p>
     <w:p>
@@ -7971,7 +8020,7 @@
         <w:pStyle w:val="references"/>
       </w:pPr>
       <w:r>
-        <w:t>J. Garcia and J. Gacu, “Optimizing hybrid energy systems for rural electrification: A case study of Sibuyan Island,” in Proc. 2025 IEEE 17th Int. Conf. Computational Intelligence and Communication Networks (CICN), 2025, doi: 10.1109/CICN67655.2025.11368002.</w:t>
+        <w:t>J. Garcia and J. Gacu, “Optimizing hybrid energy systems for rural electrification: A case study of Sibuyan Island,” in Proc. 2025 IEEE 17th Int. Conf. Computational Intelligence and Communication Networks (CICN), 2025, pp. 1652-1657, doi: 10.1109/CICN67655.2025.11368002.</w:t>
       </w:r>
     </w:p>
     <w:p>
@@ -7979,7 +8028,7 @@
         <w:pStyle w:val="references"/>
       </w:pPr>
       <w:r>
-        <w:t>R. R. M. Fajardo, E. V. Mallari, P. J. H. Vivo, M. C. Pacis, and J. Martinez Jr., “Impact study of a microgrid with battery energy storage system (BESS) and hybrid distributed energy resources using MATLAB Simulink and t-test analysis,” in Proc. 2020 IEEE 12th Int. Conf. Humanoid, Nanotechnology, Information Technology, Communication and Control, Environment, and Management (HNICEM), 2020, doi: 10.1109/HNICEM51456.2020.9400061.</w:t>
+        <w:t>R. R. M. Fajardo, E. V. Mallari, P. J. H. Vivo, M. C. Pacis, and J. Martinez Jr., “Impact study of a microgrid with battery energy storage system (BESS) and hybrid distributed energy resources using MATLAB Simulink and t-test analysis,” in Proc. 2020 IEEE 12th Int. Conf. Humanoid, Nanotechnology, Information Technology, Communication and Control, Environment, and Management (HNICEM), 2020, pp. 1-6, doi: 10.1109/HNICEM51456.2020.9400061.</w:t>
       </w:r>
     </w:p>
     <w:p>
@@ -7987,7 +8036,7 @@
         <w:pStyle w:val="references"/>
       </w:pPr>
       <w:r>
-        <w:t>J. Pao et al., “Power maximization through thermodynamic optimization of PV systems under Philippine climate conditions,” in Proc. 2025 IEEE 17th Int. Conf. Humanoid, Nanotechnology, Information Technology, Communication and Control, Environment, and Management (HNICEM), 2025, doi: 10.1109/HNICEM69498.2025.11569260.</w:t>
+        <w:t>J. Pao et al., “Power maximization through thermodynamic optimization of PV systems under Philippine climate conditions,” in Proc. 2025 IEEE 17th Int. Conf. Humanoid, Nanotechnology, Information Technology, Communication and Control, Environment, and Management (HNICEM), 2025, pp. 1-6, doi: 10.1109/HNICEM69498.2025.11569260.</w:t>
       </w:r>
     </w:p>
     <w:p>
@@ -7995,7 +8044,7 @@
         <w:pStyle w:val="references"/>
       </w:pPr>
       <w:r>
-        <w:t>NASA POWER, “Hourly API,” NASA Langley Research Center. [Online]. Available: https://power.larc.nasa.gov/docs/services/api/temporal/hourly/. Accessed: Sep. 24, 2026.</w:t>
+        <w:t>NASA POWER, “Hourly API,” NASA Langley Research Center. [Online]. Available: https://power.larc.nasa.gov/docs/services/api/temporal/hourly/. Accessed: Oct. 5, 2026.</w:t>
       </w:r>
     </w:p>
     <w:p>
@@ -8003,7 +8052,7 @@
         <w:pStyle w:val="references"/>
       </w:pPr>
       <w:r>
-        <w:t>PAGASA, “Laoag City, Ilocos Norte station profile.” [Online]. Available: https://pubfiles.pagasa.dost.gov.ph/cds/Laoag.pdf. Accessed: Sep. 24, 2026.</w:t>
+        <w:t>PAGASA, “Climatological extremes: Laoag City, Ilocos Norte, as of 2014.” [Online]. Available: https://pubfiles.pagasa.dost.gov.ph/cds/Laoag.pdf. Accessed: Oct. 5, 2026.</w:t>
       </w:r>
     </w:p>
     <w:p>
@@ -8011,7 +8060,7 @@
         <w:pStyle w:val="references"/>
       </w:pPr>
       <w:r>
-        <w:t>PAGASA, “Mactan International Airport, Cebu station profile.” [Online]. Available: https://pubfiles.pagasa.dost.gov.ph/cds/Mactan.pdf. Accessed: Sep. 24, 2026.</w:t>
+        <w:t>PAGASA, “Climatological extremes: Mactan International Airport, Cebu, as of 2014.” [Online]. Available: https://pubfiles.pagasa.dost.gov.ph/cds/Mactan.pdf. Accessed: Oct. 5, 2026.</w:t>
       </w:r>
     </w:p>
     <w:p>
@@ -8019,7 +8068,7 @@
         <w:pStyle w:val="references"/>
       </w:pPr>
       <w:r>
-        <w:t>PAGASA, “General Santos City station profile.” [Online]. Available: https://pubfiles.pagasa.dost.gov.ph/cds/General_Santos.pdf. Accessed: Sep. 24, 2026.</w:t>
+        <w:t>PAGASA, “Climatological extremes: General Santos City, as of 2014.” [Online]. Available: https://pubfiles.pagasa.dost.gov.ph/cds/General_Santos.pdf. Accessed: Oct. 5, 2026.</w:t>
       </w:r>
     </w:p>
     <w:p>
@@ -8027,7 +8076,7 @@
         <w:pStyle w:val="references"/>
       </w:pPr>
       <w:r>
-        <w:t>scikit-learn developers, “Cross validation of time series data.” [Online]. Available: https://scikit-learn.org/stable/modules/cross_validation.html#cross-validation-of-time-series-data. Accessed: Oct. 3, 2026.</w:t>
+        <w:t>scikit-learn developers, “Cross validation of time series data.” [Online]. Available: https://scikit-learn.org/stable/modules/cross_validation.html#cross-validation-of-time-series-data. Accessed: Oct. 5, 2026.</w:t>
       </w:r>
     </w:p>
     <w:p>
@@ -8035,7 +8084,7 @@
         <w:pStyle w:val="references"/>
       </w:pPr>
       <w:r>
-        <w:t>NOAA Global Monitoring Division, “General solar position calculations.” [Online]. Available: https://gml.noaa.gov/grad/solcalc/solareqns.PDF. Accessed: Oct. 3, 2026.</w:t>
+        <w:t>NOAA Global Monitoring Division, “General solar position calculations.” [Online]. Available: https://gml.noaa.gov/grad/solcalc/solareqns.PDF. Accessed: Oct. 5, 2026.</w:t>
       </w:r>
     </w:p>
     <w:p>
@@ -8043,7 +8092,7 @@
         <w:pStyle w:val="references"/>
       </w:pPr>
       <w:r>
-        <w:t>pvlib python, “pvlib.irradiance.get_total_irradiance,” version 0.13.0 documentation. [Online]. Available: https://pvlib-python.readthedocs.io/en/v0.13.0/reference/generated/pvlib.irradiance.get_total_irradiance.html. Accessed: Oct. 3, 2026.</w:t>
+        <w:t>pvlib python, “pvlib.irradiance.get_total_irradiance,” version 0.13.0 documentation. [Online]. Available: https://pvlib-python.readthedocs.io/en/v0.13.0/reference/generated/pvlib.irradiance.get_total_irradiance.html. Accessed: Oct. 5, 2026.</w:t>
       </w:r>
     </w:p>
     <w:p>
@@ -8051,7 +8100,7 @@
         <w:pStyle w:val="references"/>
       </w:pPr>
       <w:r>
-        <w:t>pvlib python, “pvlib.temperature.faiman,” version 0.9.0 documentation. [Online]. Available: https://pvlib-python.readthedocs.io/en/v0.9.0/generated/pvlib.temperature.faiman.html. Accessed: Oct. 3, 2026.</w:t>
+        <w:t>pvlib python, “pvlib.temperature.faiman,” version 0.9.0 documentation. [Online]. Available: https://pvlib-python.readthedocs.io/en/v0.9.0/generated/pvlib.temperature.faiman.html. Accessed: Oct. 5, 2026.</w:t>
       </w:r>
     </w:p>
     <w:p>
@@ -8059,7 +8108,7 @@
         <w:pStyle w:val="references"/>
       </w:pPr>
       <w:r>
-        <w:t>U.S. Department of Energy, “PLUSWIND documentation,” Dec. 2022. [Online]. Available: https://wdh.energy.gov/api/content/pluswind/documents/PLUSWIND-Documentation-20221213.pdf. Accessed: Oct. 3, 2026.</w:t>
+        <w:t>“The Plant-Level US multi-model WIND and generation (PLUSWIND) database: Metadata description,” hosted by U.S. Department of Energy Wind Data Hub, n.d. [Online]. Available: https://wdh.energy.gov/api/content/pluswind/documents/PLUSWIND-Documentation-20221213.pdf. Accessed: Oct. 5, 2026.</w:t>
       </w:r>
     </w:p>
     <w:p>
@@ -8067,7 +8116,7 @@
         <w:pStyle w:val="references"/>
       </w:pPr>
       <w:r>
-        <w:t>NOAA Climate Prediction Center, “Cold and warm episodes by season (ERSSTv6): Oceanic Niño Index.” [Online]. Available: https://www.cpc.ncep.noaa.gov/products/analysis_monitoring/enso/oni/v6/. Accessed: Oct. 3, 2026.</w:t>
+        <w:t>NOAA Climate Prediction Center, “Cold and warm episodes by season (ERSSTv6): Oceanic Niño Index.” [Online]. Available: https://www.cpc.ncep.noaa.gov/products/analysis_monitoring/enso/oni/v6/. Accessed: Oct. 5, 2026.</w:t>
       </w:r>
     </w:p>
     <w:sectPr>

</xml_diff>